<commit_message>
Riscrive la didascalia di Arturo sulle emozioni
La prima versione descriveva quello che il quadro già mostra. Annota nella
procedura che la didascalia parte dall'emozione, non dalla descrizione.

Co-Authored-By: Claude Opus 5.5 <noreply@anthropic.com>
Claude-Session: https://claude.ai/code/session_0148bZgqQiCtdshijf84M1Qp
</commit_message>
<xml_diff>
--- a/testi-critici/artisti/patrizia-vangelisti/word/opera-arturo.docx
+++ b/testi-critici/artisti/patrizia-vangelisti/word/opera-arturo.docx
@@ -63,7 +63,7 @@
           <w:color w:val="1E1B18"/>
           <w:sz w:val="21"/>
         </w:rPr>
-        <w:t>Vista dall’alto, un’ampolla d’acqua posa su uno sgabello di vimini, nell’angolo di una stanza dal pavimento a esagoni. Al centro dei cerchi azzurri Arturo, il pesce rosso, è l’unico punto acceso: un ricordo di casa custodito come in uno scrigno.</w:t>
+        <w:t>C’è un angolo di casa che la memoria non lascia andare. Arturo vi nuota in silenzio, piccola fiamma rossa in un cerchio d’acqua e di luce: custode di pensieri, compagno di giorni quieti, è il punto fermo a cui lo sguardo torna per sentirsi al riparo.</w:t>
       </w:r>
     </w:p>
     <w:p>
@@ -79,7 +79,7 @@
           <w:color w:val="6B645B"/>
           <w:sz w:val="18"/>
         </w:rPr>
-        <w:t>Seen from above, a glass bowl of water rests on a wicker stool in the corner of a room with a hexagon-tiled floor. At the centre of the blue circles Arturo, the goldfish, is the only spark of colour: a memory of home kept as in a casket.</w:t>
+        <w:t>There is a corner of home that memory will not let go. Arturo swims there in silence, a small red flame in a circle of water and light: keeper of thoughts, companion of quiet days, the still point the gaze returns to in order to feel sheltered.</w:t>
       </w:r>
     </w:p>
     <w:sectPr>

</xml_diff>